<commit_message>
FSD Assignment 1 & 2 Complete
</commit_message>
<xml_diff>
--- a/VB .NET/Practical - Assignments/Assignment1.docx
+++ b/VB .NET/Practical - Assignments/Assignment1.docx
@@ -746,6 +746,15 @@
           <w:lang w:val="en-US"/>
         </w:rPr>
         <w:tab/>
+      </w:r>
+      <w:r>
+        <w:rPr>
+          <w:rFonts w:hint="default" w:ascii="Times New Roman" w:hAnsi="Times New Roman" w:eastAsia="Cascadia Mono" w:cs="Times New Roman"/>
+          <w:color w:val="000000"/>
+          <w:sz w:val="24"/>
+          <w:szCs w:val="24"/>
+          <w:lang w:val="en-US"/>
+        </w:rPr>
         <w:t xml:space="preserve">    </w:t>
       </w:r>
       <w:r>
@@ -1825,6 +1834,15 @@
           <w:lang w:val="en-US"/>
         </w:rPr>
         <w:tab/>
+      </w:r>
+      <w:r>
+        <w:rPr>
+          <w:rFonts w:hint="default" w:ascii="Times New Roman" w:hAnsi="Times New Roman" w:eastAsia="Cascadia Mono" w:cs="Times New Roman"/>
+          <w:color w:val="000000"/>
+          <w:sz w:val="24"/>
+          <w:szCs w:val="24"/>
+          <w:lang w:val="en-US"/>
+        </w:rPr>
         <w:t xml:space="preserve">   </w:t>
       </w:r>
       <w:r>
@@ -4285,12 +4303,21 @@
       </w:pPr>
       <w:r>
         <w:rPr>
+          <w:rFonts w:hint="default" w:ascii="Times New Roman" w:hAnsi="Times New Roman" w:cs="Times New Roman"/>
+          <w:sz w:val="28"/>
+          <w:szCs w:val="28"/>
+          <w:lang w:val="en-US"/>
+        </w:rPr>
+        <w:t>ANS</w:t>
+      </w:r>
+      <w:r>
+        <w:rPr>
           <w:rFonts w:hint="default"/>
           <w:sz w:val="28"/>
           <w:szCs w:val="28"/>
           <w:lang w:val="en-US"/>
         </w:rPr>
-        <w:t xml:space="preserve">ANS:  </w:t>
+        <w:t xml:space="preserve">:  </w:t>
       </w:r>
       <w:r>
         <w:rPr>
@@ -4923,17 +4950,6 @@
       <w:pPr>
         <w:pStyle w:val="6"/>
         <w:spacing w:after="0" w:line="240" w:lineRule="auto"/>
-        <w:rPr>
-          <w:rFonts w:hint="default" w:ascii="Times New Roman" w:hAnsi="Times New Roman" w:cs="Times New Roman"/>
-          <w:sz w:val="28"/>
-          <w:szCs w:val="28"/>
-          <w:lang w:val="en-US"/>
-        </w:rPr>
-        <w:sectPr>
-          <w:pgSz w:w="11910" w:h="16840"/>
-          <w:pgMar w:top="1920" w:right="0" w:bottom="280" w:left="708" w:header="720" w:footer="720" w:gutter="0"/>
-          <w:cols w:space="720" w:num="1"/>
-        </w:sectPr>
       </w:pPr>
       <w:r>
         <w:rPr>
@@ -4987,8 +5003,1130 @@
           </wp:inline>
         </w:drawing>
       </w:r>
+    </w:p>
+    <w:p>
+      <w:pPr>
+        <w:pStyle w:val="6"/>
+        <w:spacing w:after="0" w:line="240" w:lineRule="auto"/>
+      </w:pPr>
+    </w:p>
+    <w:p>
+      <w:pPr>
+        <w:pStyle w:val="6"/>
+        <w:spacing w:after="0" w:line="240" w:lineRule="auto"/>
+      </w:pPr>
+    </w:p>
+    <w:p>
+      <w:pPr>
+        <w:pStyle w:val="6"/>
+        <w:spacing w:after="0" w:line="240" w:lineRule="auto"/>
+      </w:pPr>
+    </w:p>
+    <w:p>
+      <w:pPr>
+        <w:pStyle w:val="6"/>
+        <w:spacing w:after="0" w:line="240" w:lineRule="auto"/>
+      </w:pPr>
+    </w:p>
+    <w:p>
+      <w:pPr>
+        <w:pStyle w:val="6"/>
+        <w:spacing w:after="0" w:line="240" w:lineRule="auto"/>
+        <w:rPr>
+          <w:rFonts w:hint="default"/>
+          <w:sz w:val="32"/>
+          <w:szCs w:val="32"/>
+          <w:lang w:val="en-US"/>
+        </w:rPr>
+      </w:pPr>
+      <w:r>
+        <w:rPr>
+          <w:rFonts w:hint="default"/>
+          <w:sz w:val="32"/>
+          <w:szCs w:val="32"/>
+          <w:lang w:val="en-US"/>
+        </w:rPr>
+        <w:t>SET B:</w:t>
+      </w:r>
+    </w:p>
+    <w:p>
+      <w:pPr>
+        <w:pStyle w:val="6"/>
+        <w:spacing w:after="0" w:line="240" w:lineRule="auto"/>
+        <w:rPr>
+          <w:rFonts w:hint="default"/>
+          <w:sz w:val="32"/>
+          <w:szCs w:val="32"/>
+          <w:lang w:val="en-US"/>
+        </w:rPr>
+      </w:pPr>
+    </w:p>
+    <w:p>
+      <w:pPr>
+        <w:keepNext w:val="0"/>
+        <w:keepLines w:val="0"/>
+        <w:widowControl/>
+        <w:suppressLineNumbers w:val="0"/>
+        <w:jc w:val="left"/>
+        <w:rPr>
+          <w:sz w:val="28"/>
+          <w:szCs w:val="28"/>
+        </w:rPr>
+      </w:pPr>
+      <w:r>
+        <w:rPr>
+          <w:rFonts w:hint="default"/>
+          <w:sz w:val="28"/>
+          <w:szCs w:val="28"/>
+          <w:lang w:val="en-US"/>
+        </w:rPr>
+        <w:t xml:space="preserve">Q1: </w:t>
+      </w:r>
+      <w:r>
+        <w:rPr>
+          <w:rFonts w:hint="default" w:ascii="Times New Roman" w:hAnsi="Times New Roman" w:eastAsia="SimSun" w:cs="Times New Roman"/>
+          <w:color w:val="000000"/>
+          <w:kern w:val="0"/>
+          <w:sz w:val="28"/>
+          <w:szCs w:val="28"/>
+          <w:lang w:val="en-US" w:eastAsia="zh-CN" w:bidi="ar"/>
+        </w:rPr>
+        <w:t xml:space="preserve">Write a VB.NET program to create a menu-driven calculator and perform basic </w:t>
+      </w:r>
+    </w:p>
+    <w:p>
+      <w:pPr>
+        <w:keepNext w:val="0"/>
+        <w:keepLines w:val="0"/>
+        <w:widowControl/>
+        <w:suppressLineNumbers w:val="0"/>
+        <w:jc w:val="left"/>
+        <w:rPr>
+          <w:sz w:val="28"/>
+          <w:szCs w:val="28"/>
+        </w:rPr>
+      </w:pPr>
+      <w:r>
+        <w:rPr>
+          <w:rFonts w:hint="default" w:ascii="Times New Roman" w:hAnsi="Times New Roman" w:eastAsia="SimSun" w:cs="Times New Roman"/>
+          <w:color w:val="000000"/>
+          <w:kern w:val="0"/>
+          <w:sz w:val="28"/>
+          <w:szCs w:val="28"/>
+          <w:lang w:val="en-US" w:eastAsia="zh-CN" w:bidi="ar"/>
+        </w:rPr>
+        <w:t xml:space="preserve">arithmetic operations on the user's choice until the user selects the Exit option (using </w:t>
+      </w:r>
+    </w:p>
+    <w:p>
+      <w:pPr>
+        <w:keepNext w:val="0"/>
+        <w:keepLines w:val="0"/>
+        <w:widowControl/>
+        <w:suppressLineNumbers w:val="0"/>
+        <w:jc w:val="left"/>
+        <w:rPr>
+          <w:sz w:val="28"/>
+          <w:szCs w:val="28"/>
+        </w:rPr>
+      </w:pPr>
+      <w:r>
+        <w:rPr>
+          <w:rFonts w:hint="default" w:ascii="Times New Roman" w:hAnsi="Times New Roman" w:eastAsia="SimSun" w:cs="Times New Roman"/>
+          <w:color w:val="000000"/>
+          <w:kern w:val="0"/>
+          <w:sz w:val="28"/>
+          <w:szCs w:val="28"/>
+          <w:lang w:val="en-US" w:eastAsia="zh-CN" w:bidi="ar"/>
+        </w:rPr>
+        <w:t>the Select Case statement).</w:t>
+      </w:r>
+    </w:p>
+    <w:p>
+      <w:pPr>
+        <w:pStyle w:val="6"/>
+        <w:spacing w:after="0" w:line="240" w:lineRule="auto"/>
+        <w:rPr>
+          <w:rFonts w:hint="default"/>
+          <w:sz w:val="28"/>
+          <w:szCs w:val="28"/>
+          <w:lang w:val="en-US"/>
+        </w:rPr>
+      </w:pPr>
+    </w:p>
+    <w:p>
+      <w:pPr>
+        <w:pStyle w:val="6"/>
+        <w:spacing w:after="0" w:line="240" w:lineRule="auto"/>
+        <w:rPr>
+          <w:rFonts w:hint="default"/>
+          <w:sz w:val="28"/>
+          <w:szCs w:val="28"/>
+          <w:lang w:val="en-US"/>
+        </w:rPr>
+      </w:pPr>
+    </w:p>
+    <w:p>
+      <w:pPr>
+        <w:keepNext w:val="0"/>
+        <w:keepLines w:val="0"/>
+        <w:widowControl/>
+        <w:suppressLineNumbers w:val="0"/>
+        <w:jc w:val="left"/>
+        <w:rPr>
+          <w:sz w:val="28"/>
+          <w:szCs w:val="28"/>
+        </w:rPr>
+      </w:pPr>
+      <w:r>
+        <w:rPr>
+          <w:rFonts w:hint="default"/>
+          <w:sz w:val="28"/>
+          <w:szCs w:val="28"/>
+          <w:lang w:val="en-US"/>
+        </w:rPr>
+        <w:t xml:space="preserve">Q2: </w:t>
+      </w:r>
+      <w:r>
+        <w:rPr>
+          <w:rFonts w:hint="default" w:ascii="Times New Roman" w:hAnsi="Times New Roman" w:eastAsia="SimSun" w:cs="Times New Roman"/>
+          <w:color w:val="000000"/>
+          <w:kern w:val="0"/>
+          <w:sz w:val="28"/>
+          <w:szCs w:val="28"/>
+          <w:lang w:val="en-US" w:eastAsia="zh-CN" w:bidi="ar"/>
+        </w:rPr>
+        <w:t xml:space="preserve">Write a VB.NET program to accept a number from the user and generate its </w:t>
+      </w:r>
+    </w:p>
+    <w:p>
+      <w:pPr>
+        <w:keepNext w:val="0"/>
+        <w:keepLines w:val="0"/>
+        <w:widowControl/>
+        <w:suppressLineNumbers w:val="0"/>
+        <w:jc w:val="left"/>
+        <w:rPr>
+          <w:sz w:val="28"/>
+          <w:szCs w:val="28"/>
+        </w:rPr>
+      </w:pPr>
+      <w:r>
+        <w:rPr>
+          <w:rFonts w:hint="default" w:ascii="Times New Roman" w:hAnsi="Times New Roman" w:eastAsia="SimSun" w:cs="Times New Roman"/>
+          <w:color w:val="000000"/>
+          <w:kern w:val="0"/>
+          <w:sz w:val="28"/>
+          <w:szCs w:val="28"/>
+          <w:lang w:val="en-US" w:eastAsia="zh-CN" w:bidi="ar"/>
+        </w:rPr>
+        <w:t>multiplication table from 1 to 10.</w:t>
+      </w:r>
+    </w:p>
+    <w:p>
+      <w:pPr>
+        <w:pStyle w:val="6"/>
+        <w:spacing w:after="0" w:line="240" w:lineRule="auto"/>
+        <w:rPr>
+          <w:rFonts w:hint="default"/>
+          <w:sz w:val="28"/>
+          <w:szCs w:val="28"/>
+          <w:lang w:val="en-US"/>
+        </w:rPr>
+      </w:pPr>
+    </w:p>
+    <w:p>
+      <w:pPr>
+        <w:pStyle w:val="7"/>
+        <w:keepNext w:val="0"/>
+        <w:keepLines w:val="0"/>
+        <w:widowControl/>
+        <w:suppressLineNumbers w:val="0"/>
+        <w:rPr>
+          <w:rFonts w:hint="default" w:ascii="Times New Roman" w:hAnsi="Times New Roman" w:eastAsia="Cascadia Mono" w:cs="Times New Roman"/>
+          <w:color w:val="000000"/>
+          <w:sz w:val="24"/>
+          <w:szCs w:val="24"/>
+        </w:rPr>
+      </w:pPr>
+      <w:r>
+        <w:rPr>
+          <w:rFonts w:hint="default" w:ascii="Times New Roman" w:hAnsi="Times New Roman" w:cs="Times New Roman"/>
+          <w:sz w:val="28"/>
+          <w:szCs w:val="28"/>
+          <w:lang w:val="en-US"/>
+        </w:rPr>
+        <w:t>ANS</w:t>
+      </w:r>
+      <w:r>
+        <w:rPr>
+          <w:rFonts w:hint="default"/>
+          <w:sz w:val="28"/>
+          <w:szCs w:val="28"/>
+          <w:lang w:val="en-US"/>
+        </w:rPr>
+        <w:t xml:space="preserve">: </w:t>
+      </w:r>
+      <w:r>
+        <w:rPr>
+          <w:rFonts w:hint="default" w:ascii="Times New Roman" w:hAnsi="Times New Roman" w:eastAsia="Cascadia Mono" w:cs="Times New Roman"/>
+          <w:color w:val="0000FF"/>
+          <w:sz w:val="24"/>
+          <w:szCs w:val="24"/>
+        </w:rPr>
+        <w:t>Module</w:t>
+      </w:r>
+      <w:r>
+        <w:rPr>
+          <w:rFonts w:hint="default" w:ascii="Times New Roman" w:hAnsi="Times New Roman" w:eastAsia="Cascadia Mono" w:cs="Times New Roman"/>
+          <w:color w:val="000000"/>
+          <w:sz w:val="24"/>
+          <w:szCs w:val="24"/>
+        </w:rPr>
+        <w:t xml:space="preserve"> </w:t>
+      </w:r>
+      <w:r>
+        <w:rPr>
+          <w:rFonts w:hint="default" w:ascii="Times New Roman" w:hAnsi="Times New Roman" w:eastAsia="Cascadia Mono" w:cs="Times New Roman"/>
+          <w:color w:val="2B91AF"/>
+          <w:sz w:val="24"/>
+          <w:szCs w:val="24"/>
+        </w:rPr>
+        <w:t>program</w:t>
+      </w:r>
+    </w:p>
+    <w:p>
+      <w:pPr>
+        <w:pStyle w:val="7"/>
+        <w:keepNext w:val="0"/>
+        <w:keepLines w:val="0"/>
+        <w:widowControl/>
+        <w:suppressLineNumbers w:val="0"/>
+        <w:rPr>
+          <w:rFonts w:hint="default" w:ascii="Times New Roman" w:hAnsi="Times New Roman" w:eastAsia="Cascadia Mono" w:cs="Times New Roman"/>
+          <w:color w:val="000000"/>
+          <w:sz w:val="24"/>
+          <w:szCs w:val="24"/>
+        </w:rPr>
+      </w:pPr>
+      <w:r>
+        <w:rPr>
+          <w:rFonts w:hint="default" w:ascii="Times New Roman" w:hAnsi="Times New Roman" w:eastAsia="Cascadia Mono" w:cs="Times New Roman"/>
+          <w:color w:val="000000"/>
+          <w:sz w:val="24"/>
+          <w:szCs w:val="24"/>
+        </w:rPr>
+        <w:t xml:space="preserve">    </w:t>
+      </w:r>
+      <w:r>
+        <w:rPr>
+          <w:rFonts w:hint="default" w:ascii="Times New Roman" w:hAnsi="Times New Roman" w:eastAsia="Cascadia Mono" w:cs="Times New Roman"/>
+          <w:color w:val="000000"/>
+          <w:sz w:val="24"/>
+          <w:szCs w:val="24"/>
+          <w:lang w:val="en-US"/>
+        </w:rPr>
+        <w:tab/>
+      </w:r>
+      <w:r>
+        <w:rPr>
+          <w:rFonts w:hint="default" w:ascii="Times New Roman" w:hAnsi="Times New Roman" w:eastAsia="Cascadia Mono" w:cs="Times New Roman"/>
+          <w:color w:val="0000FF"/>
+          <w:sz w:val="24"/>
+          <w:szCs w:val="24"/>
+        </w:rPr>
+        <w:t>Sub</w:t>
+      </w:r>
+      <w:r>
+        <w:rPr>
+          <w:rFonts w:hint="default" w:ascii="Times New Roman" w:hAnsi="Times New Roman" w:eastAsia="Cascadia Mono" w:cs="Times New Roman"/>
+          <w:color w:val="000000"/>
+          <w:sz w:val="24"/>
+          <w:szCs w:val="24"/>
+        </w:rPr>
+        <w:t xml:space="preserve"> </w:t>
+      </w:r>
+      <w:r>
+        <w:rPr>
+          <w:rFonts w:hint="default" w:ascii="Times New Roman" w:hAnsi="Times New Roman" w:eastAsia="Cascadia Mono" w:cs="Times New Roman"/>
+          <w:color w:val="74531F"/>
+          <w:sz w:val="24"/>
+          <w:szCs w:val="24"/>
+        </w:rPr>
+        <w:t>main</w:t>
+      </w:r>
+      <w:r>
+        <w:rPr>
+          <w:rFonts w:hint="default" w:ascii="Times New Roman" w:hAnsi="Times New Roman" w:eastAsia="Cascadia Mono" w:cs="Times New Roman"/>
+          <w:color w:val="000000"/>
+          <w:sz w:val="24"/>
+          <w:szCs w:val="24"/>
+        </w:rPr>
+        <w:t>()</w:t>
+      </w:r>
+    </w:p>
+    <w:p>
+      <w:pPr>
+        <w:pStyle w:val="7"/>
+        <w:keepNext w:val="0"/>
+        <w:keepLines w:val="0"/>
+        <w:widowControl/>
+        <w:suppressLineNumbers w:val="0"/>
+        <w:rPr>
+          <w:rFonts w:hint="default" w:ascii="Times New Roman" w:hAnsi="Times New Roman" w:eastAsia="Cascadia Mono" w:cs="Times New Roman"/>
+          <w:color w:val="000000"/>
+          <w:sz w:val="24"/>
+          <w:szCs w:val="24"/>
+        </w:rPr>
+      </w:pPr>
+      <w:r>
+        <w:rPr>
+          <w:rFonts w:hint="default" w:ascii="Times New Roman" w:hAnsi="Times New Roman" w:eastAsia="Cascadia Mono" w:cs="Times New Roman"/>
+          <w:color w:val="000000"/>
+          <w:sz w:val="24"/>
+          <w:szCs w:val="24"/>
+        </w:rPr>
+        <w:t xml:space="preserve">        </w:t>
+      </w:r>
+      <w:r>
+        <w:rPr>
+          <w:rFonts w:hint="default" w:ascii="Times New Roman" w:hAnsi="Times New Roman" w:eastAsia="Cascadia Mono" w:cs="Times New Roman"/>
+          <w:color w:val="000000"/>
+          <w:sz w:val="24"/>
+          <w:szCs w:val="24"/>
+          <w:lang w:val="en-US"/>
+        </w:rPr>
+        <w:tab/>
+        <w:t xml:space="preserve">    </w:t>
+      </w:r>
+      <w:r>
+        <w:rPr>
+          <w:rFonts w:hint="default" w:ascii="Times New Roman" w:hAnsi="Times New Roman" w:eastAsia="Cascadia Mono" w:cs="Times New Roman"/>
+          <w:color w:val="2B91AF"/>
+          <w:sz w:val="24"/>
+          <w:szCs w:val="24"/>
+        </w:rPr>
+        <w:t>Console</w:t>
+      </w:r>
+      <w:r>
+        <w:rPr>
+          <w:rFonts w:hint="default" w:ascii="Times New Roman" w:hAnsi="Times New Roman" w:eastAsia="Cascadia Mono" w:cs="Times New Roman"/>
+          <w:color w:val="000000"/>
+          <w:sz w:val="24"/>
+          <w:szCs w:val="24"/>
+        </w:rPr>
+        <w:t>.</w:t>
+      </w:r>
+      <w:r>
+        <w:rPr>
+          <w:rFonts w:hint="default" w:ascii="Times New Roman" w:hAnsi="Times New Roman" w:eastAsia="Cascadia Mono" w:cs="Times New Roman"/>
+          <w:color w:val="74531F"/>
+          <w:sz w:val="24"/>
+          <w:szCs w:val="24"/>
+        </w:rPr>
+        <w:t>WriteLine</w:t>
+      </w:r>
+      <w:r>
+        <w:rPr>
+          <w:rFonts w:hint="default" w:ascii="Times New Roman" w:hAnsi="Times New Roman" w:eastAsia="Cascadia Mono" w:cs="Times New Roman"/>
+          <w:color w:val="000000"/>
+          <w:sz w:val="24"/>
+          <w:szCs w:val="24"/>
+        </w:rPr>
+        <w:t>(</w:t>
+      </w:r>
+      <w:r>
+        <w:rPr>
+          <w:rFonts w:hint="default" w:ascii="Times New Roman" w:hAnsi="Times New Roman" w:eastAsia="Cascadia Mono" w:cs="Times New Roman"/>
+          <w:color w:val="A31515"/>
+          <w:sz w:val="24"/>
+          <w:szCs w:val="24"/>
+        </w:rPr>
+        <w:t>"Enter num: "</w:t>
+      </w:r>
+      <w:r>
+        <w:rPr>
+          <w:rFonts w:hint="default" w:ascii="Times New Roman" w:hAnsi="Times New Roman" w:eastAsia="Cascadia Mono" w:cs="Times New Roman"/>
+          <w:color w:val="000000"/>
+          <w:sz w:val="24"/>
+          <w:szCs w:val="24"/>
+        </w:rPr>
+        <w:t>)</w:t>
+      </w:r>
+    </w:p>
+    <w:p>
+      <w:pPr>
+        <w:pStyle w:val="7"/>
+        <w:keepNext w:val="0"/>
+        <w:keepLines w:val="0"/>
+        <w:widowControl/>
+        <w:suppressLineNumbers w:val="0"/>
+        <w:rPr>
+          <w:rFonts w:hint="default" w:ascii="Times New Roman" w:hAnsi="Times New Roman" w:eastAsia="Cascadia Mono" w:cs="Times New Roman"/>
+          <w:color w:val="000000"/>
+          <w:sz w:val="24"/>
+          <w:szCs w:val="24"/>
+        </w:rPr>
+      </w:pPr>
+      <w:r>
+        <w:rPr>
+          <w:rFonts w:hint="default" w:ascii="Times New Roman" w:hAnsi="Times New Roman" w:eastAsia="Cascadia Mono" w:cs="Times New Roman"/>
+          <w:color w:val="000000"/>
+          <w:sz w:val="24"/>
+          <w:szCs w:val="24"/>
+        </w:rPr>
+        <w:t xml:space="preserve">        </w:t>
+      </w:r>
+      <w:r>
+        <w:rPr>
+          <w:rFonts w:hint="default" w:ascii="Times New Roman" w:hAnsi="Times New Roman" w:eastAsia="Cascadia Mono" w:cs="Times New Roman"/>
+          <w:color w:val="000000"/>
+          <w:sz w:val="24"/>
+          <w:szCs w:val="24"/>
+          <w:lang w:val="en-US"/>
+        </w:rPr>
+        <w:tab/>
+        <w:t xml:space="preserve">    </w:t>
+      </w:r>
+      <w:r>
+        <w:rPr>
+          <w:rFonts w:hint="default" w:ascii="Times New Roman" w:hAnsi="Times New Roman" w:eastAsia="Cascadia Mono" w:cs="Times New Roman"/>
+          <w:color w:val="0000FF"/>
+          <w:sz w:val="24"/>
+          <w:szCs w:val="24"/>
+        </w:rPr>
+        <w:t>Dim</w:t>
+      </w:r>
+      <w:r>
+        <w:rPr>
+          <w:rFonts w:hint="default" w:ascii="Times New Roman" w:hAnsi="Times New Roman" w:eastAsia="Cascadia Mono" w:cs="Times New Roman"/>
+          <w:color w:val="000000"/>
+          <w:sz w:val="24"/>
+          <w:szCs w:val="24"/>
+        </w:rPr>
+        <w:t xml:space="preserve"> </w:t>
+      </w:r>
+      <w:r>
+        <w:rPr>
+          <w:rFonts w:hint="default" w:ascii="Times New Roman" w:hAnsi="Times New Roman" w:eastAsia="Cascadia Mono" w:cs="Times New Roman"/>
+          <w:color w:val="1F377F"/>
+          <w:sz w:val="24"/>
+          <w:szCs w:val="24"/>
+        </w:rPr>
+        <w:t>a</w:t>
+      </w:r>
+      <w:r>
+        <w:rPr>
+          <w:rFonts w:hint="default" w:ascii="Times New Roman" w:hAnsi="Times New Roman" w:eastAsia="Cascadia Mono" w:cs="Times New Roman"/>
+          <w:color w:val="000000"/>
+          <w:sz w:val="24"/>
+          <w:szCs w:val="24"/>
+        </w:rPr>
+        <w:t xml:space="preserve"> </w:t>
+      </w:r>
+      <w:r>
+        <w:rPr>
+          <w:rFonts w:hint="default" w:ascii="Times New Roman" w:hAnsi="Times New Roman" w:eastAsia="Cascadia Mono" w:cs="Times New Roman"/>
+          <w:color w:val="0000FF"/>
+          <w:sz w:val="24"/>
+          <w:szCs w:val="24"/>
+        </w:rPr>
+        <w:t>As</w:t>
+      </w:r>
+      <w:r>
+        <w:rPr>
+          <w:rFonts w:hint="default" w:ascii="Times New Roman" w:hAnsi="Times New Roman" w:eastAsia="Cascadia Mono" w:cs="Times New Roman"/>
+          <w:color w:val="000000"/>
+          <w:sz w:val="24"/>
+          <w:szCs w:val="24"/>
+        </w:rPr>
+        <w:t xml:space="preserve"> </w:t>
+      </w:r>
+      <w:r>
+        <w:rPr>
+          <w:rFonts w:hint="default" w:ascii="Times New Roman" w:hAnsi="Times New Roman" w:eastAsia="Cascadia Mono" w:cs="Times New Roman"/>
+          <w:color w:val="0000FF"/>
+          <w:sz w:val="24"/>
+          <w:szCs w:val="24"/>
+        </w:rPr>
+        <w:t>Integer</w:t>
+      </w:r>
+      <w:r>
+        <w:rPr>
+          <w:rFonts w:hint="default" w:ascii="Times New Roman" w:hAnsi="Times New Roman" w:eastAsia="Cascadia Mono" w:cs="Times New Roman"/>
+          <w:color w:val="000000"/>
+          <w:sz w:val="24"/>
+          <w:szCs w:val="24"/>
+        </w:rPr>
+        <w:t xml:space="preserve"> = </w:t>
+      </w:r>
+      <w:r>
+        <w:rPr>
+          <w:rFonts w:hint="default" w:ascii="Times New Roman" w:hAnsi="Times New Roman" w:eastAsia="Cascadia Mono" w:cs="Times New Roman"/>
+          <w:color w:val="2B91AF"/>
+          <w:sz w:val="24"/>
+          <w:szCs w:val="24"/>
+        </w:rPr>
+        <w:t>Console</w:t>
+      </w:r>
+      <w:r>
+        <w:rPr>
+          <w:rFonts w:hint="default" w:ascii="Times New Roman" w:hAnsi="Times New Roman" w:eastAsia="Cascadia Mono" w:cs="Times New Roman"/>
+          <w:color w:val="000000"/>
+          <w:sz w:val="24"/>
+          <w:szCs w:val="24"/>
+        </w:rPr>
+        <w:t>.</w:t>
+      </w:r>
+      <w:r>
+        <w:rPr>
+          <w:rFonts w:hint="default" w:ascii="Times New Roman" w:hAnsi="Times New Roman" w:eastAsia="Cascadia Mono" w:cs="Times New Roman"/>
+          <w:color w:val="74531F"/>
+          <w:sz w:val="24"/>
+          <w:szCs w:val="24"/>
+        </w:rPr>
+        <w:t>ReadLine</w:t>
+      </w:r>
+      <w:r>
+        <w:rPr>
+          <w:rFonts w:hint="default" w:ascii="Times New Roman" w:hAnsi="Times New Roman" w:eastAsia="Cascadia Mono" w:cs="Times New Roman"/>
+          <w:color w:val="000000"/>
+          <w:sz w:val="24"/>
+          <w:szCs w:val="24"/>
+        </w:rPr>
+        <w:t>()</w:t>
+      </w:r>
+    </w:p>
+    <w:p>
+      <w:pPr>
+        <w:pStyle w:val="7"/>
+        <w:keepNext w:val="0"/>
+        <w:keepLines w:val="0"/>
+        <w:widowControl/>
+        <w:suppressLineNumbers w:val="0"/>
+        <w:rPr>
+          <w:rFonts w:hint="default" w:ascii="Times New Roman" w:hAnsi="Times New Roman" w:eastAsia="Cascadia Mono" w:cs="Times New Roman"/>
+          <w:color w:val="000000"/>
+          <w:sz w:val="24"/>
+          <w:szCs w:val="24"/>
+        </w:rPr>
+      </w:pPr>
+      <w:r>
+        <w:rPr>
+          <w:rFonts w:hint="default" w:ascii="Times New Roman" w:hAnsi="Times New Roman" w:eastAsia="Cascadia Mono" w:cs="Times New Roman"/>
+          <w:color w:val="000000"/>
+          <w:sz w:val="24"/>
+          <w:szCs w:val="24"/>
+        </w:rPr>
+        <w:t xml:space="preserve">       </w:t>
+      </w:r>
+      <w:r>
+        <w:rPr>
+          <w:rFonts w:hint="default" w:ascii="Times New Roman" w:hAnsi="Times New Roman" w:eastAsia="Cascadia Mono" w:cs="Times New Roman"/>
+          <w:color w:val="000000"/>
+          <w:sz w:val="24"/>
+          <w:szCs w:val="24"/>
+          <w:lang w:val="en-US"/>
+        </w:rPr>
+        <w:t xml:space="preserve">            </w:t>
+      </w:r>
+      <w:r>
+        <w:rPr>
+          <w:rFonts w:hint="default" w:ascii="Times New Roman" w:hAnsi="Times New Roman" w:eastAsia="Cascadia Mono" w:cs="Times New Roman"/>
+          <w:color w:val="000000"/>
+          <w:sz w:val="24"/>
+          <w:szCs w:val="24"/>
+        </w:rPr>
+        <w:t xml:space="preserve"> </w:t>
+      </w:r>
+      <w:r>
+        <w:rPr>
+          <w:rFonts w:hint="default" w:ascii="Times New Roman" w:hAnsi="Times New Roman" w:eastAsia="Cascadia Mono" w:cs="Times New Roman"/>
+          <w:color w:val="8F08C4"/>
+          <w:sz w:val="24"/>
+          <w:szCs w:val="24"/>
+        </w:rPr>
+        <w:t>For</w:t>
+      </w:r>
+      <w:r>
+        <w:rPr>
+          <w:rFonts w:hint="default" w:ascii="Times New Roman" w:hAnsi="Times New Roman" w:eastAsia="Cascadia Mono" w:cs="Times New Roman"/>
+          <w:color w:val="000000"/>
+          <w:sz w:val="24"/>
+          <w:szCs w:val="24"/>
+        </w:rPr>
+        <w:t xml:space="preserve"> i </w:t>
+      </w:r>
+      <w:r>
+        <w:rPr>
+          <w:rFonts w:hint="default" w:ascii="Times New Roman" w:hAnsi="Times New Roman" w:eastAsia="Cascadia Mono" w:cs="Times New Roman"/>
+          <w:color w:val="0000FF"/>
+          <w:sz w:val="24"/>
+          <w:szCs w:val="24"/>
+        </w:rPr>
+        <w:t>As</w:t>
+      </w:r>
+      <w:r>
+        <w:rPr>
+          <w:rFonts w:hint="default" w:ascii="Times New Roman" w:hAnsi="Times New Roman" w:eastAsia="Cascadia Mono" w:cs="Times New Roman"/>
+          <w:color w:val="000000"/>
+          <w:sz w:val="24"/>
+          <w:szCs w:val="24"/>
+        </w:rPr>
+        <w:t xml:space="preserve"> </w:t>
+      </w:r>
+      <w:r>
+        <w:rPr>
+          <w:rFonts w:hint="default" w:ascii="Times New Roman" w:hAnsi="Times New Roman" w:eastAsia="Cascadia Mono" w:cs="Times New Roman"/>
+          <w:color w:val="0000FF"/>
+          <w:sz w:val="24"/>
+          <w:szCs w:val="24"/>
+        </w:rPr>
+        <w:t>Integer</w:t>
+      </w:r>
+      <w:r>
+        <w:rPr>
+          <w:rFonts w:hint="default" w:ascii="Times New Roman" w:hAnsi="Times New Roman" w:eastAsia="Cascadia Mono" w:cs="Times New Roman"/>
+          <w:color w:val="000000"/>
+          <w:sz w:val="24"/>
+          <w:szCs w:val="24"/>
+        </w:rPr>
+        <w:t xml:space="preserve"> = 1 </w:t>
+      </w:r>
+      <w:r>
+        <w:rPr>
+          <w:rFonts w:hint="default" w:ascii="Times New Roman" w:hAnsi="Times New Roman" w:eastAsia="Cascadia Mono" w:cs="Times New Roman"/>
+          <w:color w:val="8F08C4"/>
+          <w:sz w:val="24"/>
+          <w:szCs w:val="24"/>
+        </w:rPr>
+        <w:t>To</w:t>
+      </w:r>
+      <w:r>
+        <w:rPr>
+          <w:rFonts w:hint="default" w:ascii="Times New Roman" w:hAnsi="Times New Roman" w:eastAsia="Cascadia Mono" w:cs="Times New Roman"/>
+          <w:color w:val="000000"/>
+          <w:sz w:val="24"/>
+          <w:szCs w:val="24"/>
+        </w:rPr>
+        <w:t xml:space="preserve"> 10</w:t>
+      </w:r>
+    </w:p>
+    <w:p>
+      <w:pPr>
+        <w:pStyle w:val="7"/>
+        <w:keepNext w:val="0"/>
+        <w:keepLines w:val="0"/>
+        <w:widowControl/>
+        <w:suppressLineNumbers w:val="0"/>
+        <w:rPr>
+          <w:rFonts w:hint="default" w:ascii="Times New Roman" w:hAnsi="Times New Roman" w:eastAsia="Cascadia Mono" w:cs="Times New Roman"/>
+          <w:color w:val="000000"/>
+          <w:sz w:val="24"/>
+          <w:szCs w:val="24"/>
+        </w:rPr>
+      </w:pPr>
+      <w:r>
+        <w:rPr>
+          <w:rFonts w:hint="default" w:ascii="Times New Roman" w:hAnsi="Times New Roman" w:eastAsia="Cascadia Mono" w:cs="Times New Roman"/>
+          <w:color w:val="000000"/>
+          <w:sz w:val="24"/>
+          <w:szCs w:val="24"/>
+        </w:rPr>
+        <w:t xml:space="preserve">            </w:t>
+      </w:r>
+      <w:r>
+        <w:rPr>
+          <w:rFonts w:hint="default" w:ascii="Times New Roman" w:hAnsi="Times New Roman" w:eastAsia="Cascadia Mono" w:cs="Times New Roman"/>
+          <w:color w:val="000000"/>
+          <w:sz w:val="24"/>
+          <w:szCs w:val="24"/>
+          <w:lang w:val="en-US"/>
+        </w:rPr>
+        <w:t xml:space="preserve">        </w:t>
+      </w:r>
+      <w:r>
+        <w:rPr>
+          <w:rFonts w:hint="default" w:ascii="Times New Roman" w:hAnsi="Times New Roman" w:eastAsia="Cascadia Mono" w:cs="Times New Roman"/>
+          <w:color w:val="2B91AF"/>
+          <w:sz w:val="24"/>
+          <w:szCs w:val="24"/>
+        </w:rPr>
+        <w:t>Console</w:t>
+      </w:r>
+      <w:r>
+        <w:rPr>
+          <w:rFonts w:hint="default" w:ascii="Times New Roman" w:hAnsi="Times New Roman" w:eastAsia="Cascadia Mono" w:cs="Times New Roman"/>
+          <w:color w:val="000000"/>
+          <w:sz w:val="24"/>
+          <w:szCs w:val="24"/>
+        </w:rPr>
+        <w:t>.</w:t>
+      </w:r>
+      <w:r>
+        <w:rPr>
+          <w:rFonts w:hint="default" w:ascii="Times New Roman" w:hAnsi="Times New Roman" w:eastAsia="Cascadia Mono" w:cs="Times New Roman"/>
+          <w:color w:val="74531F"/>
+          <w:sz w:val="24"/>
+          <w:szCs w:val="24"/>
+        </w:rPr>
+        <w:t>WriteLine</w:t>
+      </w:r>
+      <w:r>
+        <w:rPr>
+          <w:rFonts w:hint="default" w:ascii="Times New Roman" w:hAnsi="Times New Roman" w:eastAsia="Cascadia Mono" w:cs="Times New Roman"/>
+          <w:color w:val="000000"/>
+          <w:sz w:val="24"/>
+          <w:szCs w:val="24"/>
+        </w:rPr>
+        <w:t>(</w:t>
+      </w:r>
+      <w:r>
+        <w:rPr>
+          <w:rFonts w:hint="default" w:ascii="Times New Roman" w:hAnsi="Times New Roman" w:eastAsia="Cascadia Mono" w:cs="Times New Roman"/>
+          <w:color w:val="A31515"/>
+          <w:sz w:val="24"/>
+          <w:szCs w:val="24"/>
+        </w:rPr>
+        <w:t>$"</w:t>
+      </w:r>
+      <w:r>
+        <w:rPr>
+          <w:rFonts w:hint="default" w:ascii="Times New Roman" w:hAnsi="Times New Roman" w:eastAsia="Cascadia Mono" w:cs="Times New Roman"/>
+          <w:color w:val="000000"/>
+          <w:sz w:val="24"/>
+          <w:szCs w:val="24"/>
+        </w:rPr>
+        <w:t>{</w:t>
+      </w:r>
+      <w:r>
+        <w:rPr>
+          <w:rFonts w:hint="default" w:ascii="Times New Roman" w:hAnsi="Times New Roman" w:eastAsia="Cascadia Mono" w:cs="Times New Roman"/>
+          <w:color w:val="1F377F"/>
+          <w:sz w:val="24"/>
+          <w:szCs w:val="24"/>
+        </w:rPr>
+        <w:t>a</w:t>
+      </w:r>
+      <w:r>
+        <w:rPr>
+          <w:rFonts w:hint="default" w:ascii="Times New Roman" w:hAnsi="Times New Roman" w:eastAsia="Cascadia Mono" w:cs="Times New Roman"/>
+          <w:color w:val="000000"/>
+          <w:sz w:val="24"/>
+          <w:szCs w:val="24"/>
+        </w:rPr>
+        <w:t>}</w:t>
+      </w:r>
+      <w:r>
+        <w:rPr>
+          <w:rFonts w:hint="default" w:ascii="Times New Roman" w:hAnsi="Times New Roman" w:eastAsia="Cascadia Mono" w:cs="Times New Roman"/>
+          <w:color w:val="A31515"/>
+          <w:sz w:val="24"/>
+          <w:szCs w:val="24"/>
+        </w:rPr>
+        <w:t xml:space="preserve"> x </w:t>
+      </w:r>
+      <w:r>
+        <w:rPr>
+          <w:rFonts w:hint="default" w:ascii="Times New Roman" w:hAnsi="Times New Roman" w:eastAsia="Cascadia Mono" w:cs="Times New Roman"/>
+          <w:color w:val="000000"/>
+          <w:sz w:val="24"/>
+          <w:szCs w:val="24"/>
+        </w:rPr>
+        <w:t>{</w:t>
+      </w:r>
+      <w:r>
+        <w:rPr>
+          <w:rFonts w:hint="default" w:ascii="Times New Roman" w:hAnsi="Times New Roman" w:eastAsia="Cascadia Mono" w:cs="Times New Roman"/>
+          <w:color w:val="1F377F"/>
+          <w:sz w:val="24"/>
+          <w:szCs w:val="24"/>
+        </w:rPr>
+        <w:t>i</w:t>
+      </w:r>
+      <w:r>
+        <w:rPr>
+          <w:rFonts w:hint="default" w:ascii="Times New Roman" w:hAnsi="Times New Roman" w:eastAsia="Cascadia Mono" w:cs="Times New Roman"/>
+          <w:color w:val="000000"/>
+          <w:sz w:val="24"/>
+          <w:szCs w:val="24"/>
+        </w:rPr>
+        <w:t>}</w:t>
+      </w:r>
+      <w:r>
+        <w:rPr>
+          <w:rFonts w:hint="default" w:ascii="Times New Roman" w:hAnsi="Times New Roman" w:eastAsia="Cascadia Mono" w:cs="Times New Roman"/>
+          <w:color w:val="A31515"/>
+          <w:sz w:val="24"/>
+          <w:szCs w:val="24"/>
+        </w:rPr>
+        <w:t xml:space="preserve"> = </w:t>
+      </w:r>
+      <w:r>
+        <w:rPr>
+          <w:rFonts w:hint="default" w:ascii="Times New Roman" w:hAnsi="Times New Roman" w:eastAsia="Cascadia Mono" w:cs="Times New Roman"/>
+          <w:color w:val="000000"/>
+          <w:sz w:val="24"/>
+          <w:szCs w:val="24"/>
+        </w:rPr>
+        <w:t>{</w:t>
+      </w:r>
+      <w:r>
+        <w:rPr>
+          <w:rFonts w:hint="default" w:ascii="Times New Roman" w:hAnsi="Times New Roman" w:eastAsia="Cascadia Mono" w:cs="Times New Roman"/>
+          <w:color w:val="1F377F"/>
+          <w:sz w:val="24"/>
+          <w:szCs w:val="24"/>
+        </w:rPr>
+        <w:t>a</w:t>
+      </w:r>
+      <w:r>
+        <w:rPr>
+          <w:rFonts w:hint="default" w:ascii="Times New Roman" w:hAnsi="Times New Roman" w:eastAsia="Cascadia Mono" w:cs="Times New Roman"/>
+          <w:color w:val="000000"/>
+          <w:sz w:val="24"/>
+          <w:szCs w:val="24"/>
+        </w:rPr>
+        <w:t xml:space="preserve"> * </w:t>
+      </w:r>
+      <w:r>
+        <w:rPr>
+          <w:rFonts w:hint="default" w:ascii="Times New Roman" w:hAnsi="Times New Roman" w:eastAsia="Cascadia Mono" w:cs="Times New Roman"/>
+          <w:color w:val="1F377F"/>
+          <w:sz w:val="24"/>
+          <w:szCs w:val="24"/>
+        </w:rPr>
+        <w:t>i</w:t>
+      </w:r>
+      <w:r>
+        <w:rPr>
+          <w:rFonts w:hint="default" w:ascii="Times New Roman" w:hAnsi="Times New Roman" w:eastAsia="Cascadia Mono" w:cs="Times New Roman"/>
+          <w:color w:val="000000"/>
+          <w:sz w:val="24"/>
+          <w:szCs w:val="24"/>
+        </w:rPr>
+        <w:t>}</w:t>
+      </w:r>
+      <w:r>
+        <w:rPr>
+          <w:rFonts w:hint="default" w:ascii="Times New Roman" w:hAnsi="Times New Roman" w:eastAsia="Cascadia Mono" w:cs="Times New Roman"/>
+          <w:color w:val="A31515"/>
+          <w:sz w:val="24"/>
+          <w:szCs w:val="24"/>
+        </w:rPr>
+        <w:t>"</w:t>
+      </w:r>
+      <w:r>
+        <w:rPr>
+          <w:rFonts w:hint="default" w:ascii="Times New Roman" w:hAnsi="Times New Roman" w:eastAsia="Cascadia Mono" w:cs="Times New Roman"/>
+          <w:color w:val="000000"/>
+          <w:sz w:val="24"/>
+          <w:szCs w:val="24"/>
+        </w:rPr>
+        <w:t>)</w:t>
+      </w:r>
+    </w:p>
+    <w:p>
+      <w:pPr>
+        <w:pStyle w:val="7"/>
+        <w:keepNext w:val="0"/>
+        <w:keepLines w:val="0"/>
+        <w:widowControl/>
+        <w:suppressLineNumbers w:val="0"/>
+        <w:rPr>
+          <w:rFonts w:hint="default" w:ascii="Times New Roman" w:hAnsi="Times New Roman" w:eastAsia="Cascadia Mono" w:cs="Times New Roman"/>
+          <w:color w:val="000000"/>
+          <w:sz w:val="24"/>
+          <w:szCs w:val="24"/>
+        </w:rPr>
+      </w:pPr>
+      <w:r>
+        <w:rPr>
+          <w:rFonts w:hint="default" w:ascii="Times New Roman" w:hAnsi="Times New Roman" w:eastAsia="Cascadia Mono" w:cs="Times New Roman"/>
+          <w:color w:val="000000"/>
+          <w:sz w:val="24"/>
+          <w:szCs w:val="24"/>
+        </w:rPr>
+        <w:t xml:space="preserve">       </w:t>
+      </w:r>
+      <w:r>
+        <w:rPr>
+          <w:rFonts w:hint="default" w:ascii="Times New Roman" w:hAnsi="Times New Roman" w:eastAsia="Cascadia Mono" w:cs="Times New Roman"/>
+          <w:color w:val="000000"/>
+          <w:sz w:val="24"/>
+          <w:szCs w:val="24"/>
+          <w:lang w:val="en-US"/>
+        </w:rPr>
+        <w:t xml:space="preserve">            </w:t>
+      </w:r>
+      <w:r>
+        <w:rPr>
+          <w:rFonts w:hint="default" w:ascii="Times New Roman" w:hAnsi="Times New Roman" w:eastAsia="Cascadia Mono" w:cs="Times New Roman"/>
+          <w:color w:val="000000"/>
+          <w:sz w:val="24"/>
+          <w:szCs w:val="24"/>
+        </w:rPr>
+        <w:t xml:space="preserve"> </w:t>
+      </w:r>
+      <w:r>
+        <w:rPr>
+          <w:rFonts w:hint="default" w:ascii="Times New Roman" w:hAnsi="Times New Roman" w:eastAsia="Cascadia Mono" w:cs="Times New Roman"/>
+          <w:color w:val="8F08C4"/>
+          <w:sz w:val="24"/>
+          <w:szCs w:val="24"/>
+        </w:rPr>
+        <w:t>Next</w:t>
+      </w:r>
+    </w:p>
+    <w:p>
+      <w:pPr>
+        <w:pStyle w:val="7"/>
+        <w:keepNext w:val="0"/>
+        <w:keepLines w:val="0"/>
+        <w:widowControl/>
+        <w:suppressLineNumbers w:val="0"/>
+        <w:ind w:firstLine="960" w:firstLineChars="400"/>
+        <w:rPr>
+          <w:rFonts w:hint="default" w:ascii="Times New Roman" w:hAnsi="Times New Roman" w:eastAsia="Cascadia Mono" w:cs="Times New Roman"/>
+          <w:color w:val="0000FF"/>
+          <w:sz w:val="24"/>
+          <w:szCs w:val="24"/>
+        </w:rPr>
+      </w:pPr>
+      <w:r>
+        <w:rPr>
+          <w:rFonts w:hint="default" w:ascii="Times New Roman" w:hAnsi="Times New Roman" w:eastAsia="Cascadia Mono" w:cs="Times New Roman"/>
+          <w:color w:val="0000FF"/>
+          <w:sz w:val="24"/>
+          <w:szCs w:val="24"/>
+        </w:rPr>
+        <w:t>End</w:t>
+      </w:r>
+      <w:r>
+        <w:rPr>
+          <w:rFonts w:hint="default" w:ascii="Times New Roman" w:hAnsi="Times New Roman" w:eastAsia="Cascadia Mono" w:cs="Times New Roman"/>
+          <w:color w:val="000000"/>
+          <w:sz w:val="24"/>
+          <w:szCs w:val="24"/>
+        </w:rPr>
+        <w:t xml:space="preserve"> </w:t>
+      </w:r>
+      <w:r>
+        <w:rPr>
+          <w:rFonts w:hint="default" w:ascii="Times New Roman" w:hAnsi="Times New Roman" w:eastAsia="Cascadia Mono" w:cs="Times New Roman"/>
+          <w:color w:val="0000FF"/>
+          <w:sz w:val="24"/>
+          <w:szCs w:val="24"/>
+        </w:rPr>
+        <w:t>Sub</w:t>
+      </w:r>
       <w:bookmarkStart w:id="0" w:name="_GoBack"/>
       <w:bookmarkEnd w:id="0"/>
+    </w:p>
+    <w:p>
+      <w:pPr>
+        <w:pStyle w:val="7"/>
+        <w:keepNext w:val="0"/>
+        <w:keepLines w:val="0"/>
+        <w:widowControl/>
+        <w:suppressLineNumbers w:val="0"/>
+        <w:ind w:firstLine="741" w:firstLineChars="309"/>
+        <w:rPr>
+          <w:rFonts w:hint="default" w:ascii="Times New Roman" w:hAnsi="Times New Roman" w:eastAsia="Cascadia Mono" w:cs="Times New Roman"/>
+          <w:color w:val="000000"/>
+          <w:sz w:val="24"/>
+          <w:szCs w:val="24"/>
+        </w:rPr>
+      </w:pPr>
+      <w:r>
+        <w:rPr>
+          <w:rFonts w:hint="default" w:ascii="Times New Roman" w:hAnsi="Times New Roman" w:eastAsia="Cascadia Mono" w:cs="Times New Roman"/>
+          <w:color w:val="0000FF"/>
+          <w:sz w:val="24"/>
+          <w:szCs w:val="24"/>
+        </w:rPr>
+        <w:t>End</w:t>
+      </w:r>
+      <w:r>
+        <w:rPr>
+          <w:rFonts w:hint="default" w:ascii="Times New Roman" w:hAnsi="Times New Roman" w:eastAsia="Cascadia Mono" w:cs="Times New Roman"/>
+          <w:color w:val="000000"/>
+          <w:sz w:val="24"/>
+          <w:szCs w:val="24"/>
+        </w:rPr>
+        <w:t xml:space="preserve"> </w:t>
+      </w:r>
+      <w:r>
+        <w:rPr>
+          <w:rFonts w:hint="default" w:ascii="Times New Roman" w:hAnsi="Times New Roman" w:eastAsia="Cascadia Mono" w:cs="Times New Roman"/>
+          <w:color w:val="0000FF"/>
+          <w:sz w:val="24"/>
+          <w:szCs w:val="24"/>
+        </w:rPr>
+        <w:t>Module</w:t>
+      </w:r>
+    </w:p>
+    <w:p>
+      <w:pPr>
+        <w:pStyle w:val="6"/>
+        <w:spacing w:after="0" w:line="240" w:lineRule="auto"/>
+        <w:rPr>
+          <w:rFonts w:hint="default" w:ascii="Times New Roman" w:hAnsi="Times New Roman" w:cs="Times New Roman"/>
+          <w:sz w:val="24"/>
+          <w:szCs w:val="24"/>
+          <w:lang w:val="en-US"/>
+        </w:rPr>
+      </w:pPr>
+    </w:p>
+    <w:p>
+      <w:pPr>
+        <w:keepNext w:val="0"/>
+        <w:keepLines w:val="0"/>
+        <w:widowControl/>
+        <w:suppressLineNumbers w:val="0"/>
+        <w:jc w:val="left"/>
+        <w:rPr>
+          <w:sz w:val="28"/>
+          <w:szCs w:val="28"/>
+        </w:rPr>
+      </w:pPr>
+      <w:r>
+        <w:rPr>
+          <w:rFonts w:hint="default" w:ascii="Times New Roman" w:hAnsi="Times New Roman" w:cs="Times New Roman"/>
+          <w:sz w:val="28"/>
+          <w:szCs w:val="28"/>
+          <w:lang w:val="en-US"/>
+        </w:rPr>
+        <w:t>Q3:</w:t>
+      </w:r>
+      <w:r>
+        <w:rPr>
+          <w:rFonts w:hint="default" w:ascii="Times New Roman" w:hAnsi="Times New Roman" w:eastAsia="SimSun" w:cs="Times New Roman"/>
+          <w:color w:val="000000"/>
+          <w:kern w:val="0"/>
+          <w:sz w:val="28"/>
+          <w:szCs w:val="28"/>
+          <w:lang w:val="en-US" w:eastAsia="zh-CN" w:bidi="ar"/>
+        </w:rPr>
+        <w:t>Write a VB.NET program to check whether a given number is prime or not.</w:t>
+      </w:r>
+    </w:p>
+    <w:p>
+      <w:pPr>
+        <w:pStyle w:val="6"/>
+        <w:spacing w:after="0" w:line="240" w:lineRule="auto"/>
+        <w:rPr>
+          <w:rFonts w:hint="default" w:ascii="Times New Roman" w:hAnsi="Times New Roman" w:cs="Times New Roman"/>
+          <w:sz w:val="28"/>
+          <w:szCs w:val="28"/>
+          <w:lang w:val="en-US"/>
+        </w:rPr>
+        <w:sectPr>
+          <w:pgSz w:w="11910" w:h="16840"/>
+          <w:pgMar w:top="1920" w:right="0" w:bottom="280" w:left="708" w:header="720" w:footer="720" w:gutter="0"/>
+          <w:cols w:space="720" w:num="1"/>
+        </w:sectPr>
+      </w:pPr>
     </w:p>
     <w:p>
       <w:pPr>
@@ -5167,7 +6305,7 @@
     <w:lsdException w:unhideWhenUsed="0" w:uiPriority="0" w:semiHidden="0" w:name="HTML Code"/>
     <w:lsdException w:unhideWhenUsed="0" w:uiPriority="0" w:semiHidden="0" w:name="HTML Definition"/>
     <w:lsdException w:unhideWhenUsed="0" w:uiPriority="0" w:semiHidden="0" w:name="HTML Keyboard"/>
-    <w:lsdException w:unhideWhenUsed="0" w:uiPriority="0" w:semiHidden="0" w:name="HTML Preformatted"/>
+    <w:lsdException w:qFormat="1" w:unhideWhenUsed="0" w:uiPriority="0" w:semiHidden="0" w:name="HTML Preformatted"/>
     <w:lsdException w:unhideWhenUsed="0" w:uiPriority="0" w:semiHidden="0" w:name="HTML Sample"/>
     <w:lsdException w:unhideWhenUsed="0" w:uiPriority="0" w:semiHidden="0" w:name="HTML Typewriter"/>
     <w:lsdException w:unhideWhenUsed="0" w:uiPriority="0" w:semiHidden="0" w:name="HTML Variable"/>
@@ -5409,6 +6547,7 @@
   </w:style>
   <w:style w:type="paragraph" w:styleId="7">
     <w:name w:val="HTML Preformatted"/>
+    <w:qFormat/>
     <w:uiPriority w:val="0"/>
     <w:pPr>
       <w:tabs>

</xml_diff>